<commit_message>
Lecture 5 to 9 Added
</commit_message>
<xml_diff>
--- a/Course Outline.docx
+++ b/Course Outline.docx
@@ -164,6 +164,367 @@
         </w:rPr>
         <w:t xml:space="preserve"> Summary Sheet</w:t>
       </w:r>
+    </w:p>
+    <w:p>
+      <w:pPr>
+        <w:pStyle w:val="ListParagraph"/>
+        <w:numPr>
+          <w:ilvl w:val="0"/>
+          <w:numId w:val="1"/>
+        </w:numPr>
+        <w:rPr>
+          <w:rFonts w:asciiTheme="majorBidi" w:hAnsiTheme="majorBidi" w:cstheme="majorBidi"/>
+          <w:sz w:val="48"/>
+          <w:szCs w:val="48"/>
+          <w:lang w:val="en-US"/>
+        </w:rPr>
+      </w:pPr>
+      <w:r>
+        <w:rPr>
+          <w:rFonts w:asciiTheme="majorBidi" w:hAnsiTheme="majorBidi" w:cstheme="majorBidi"/>
+          <w:sz w:val="48"/>
+          <w:szCs w:val="48"/>
+          <w:lang w:val="en-US"/>
+        </w:rPr>
+        <w:t>Alignment</w:t>
+      </w:r>
+    </w:p>
+    <w:p>
+      <w:pPr>
+        <w:pStyle w:val="ListParagraph"/>
+        <w:numPr>
+          <w:ilvl w:val="0"/>
+          <w:numId w:val="1"/>
+        </w:numPr>
+        <w:rPr>
+          <w:rFonts w:asciiTheme="majorBidi" w:hAnsiTheme="majorBidi" w:cstheme="majorBidi"/>
+          <w:sz w:val="48"/>
+          <w:szCs w:val="48"/>
+          <w:lang w:val="en-US"/>
+        </w:rPr>
+      </w:pPr>
+      <w:r>
+        <w:rPr>
+          <w:rFonts w:asciiTheme="majorBidi" w:hAnsiTheme="majorBidi" w:cstheme="majorBidi"/>
+          <w:sz w:val="48"/>
+          <w:szCs w:val="48"/>
+          <w:lang w:val="en-US"/>
+        </w:rPr>
+        <w:t>Practice Statement</w:t>
+      </w:r>
+    </w:p>
+    <w:p>
+      <w:pPr>
+        <w:pStyle w:val="ListParagraph"/>
+        <w:numPr>
+          <w:ilvl w:val="0"/>
+          <w:numId w:val="1"/>
+        </w:numPr>
+        <w:rPr>
+          <w:rFonts w:asciiTheme="majorBidi" w:hAnsiTheme="majorBidi" w:cstheme="majorBidi"/>
+          <w:sz w:val="48"/>
+          <w:szCs w:val="48"/>
+          <w:lang w:val="en-US"/>
+        </w:rPr>
+      </w:pPr>
+      <w:r>
+        <w:rPr>
+          <w:rFonts w:asciiTheme="majorBidi" w:hAnsiTheme="majorBidi" w:cstheme="majorBidi"/>
+          <w:sz w:val="48"/>
+          <w:szCs w:val="48"/>
+          <w:lang w:val="en-US"/>
+        </w:rPr>
+        <w:t>Add one zero in front of mobile number</w:t>
+      </w:r>
+    </w:p>
+    <w:p>
+      <w:pPr>
+        <w:pStyle w:val="ListParagraph"/>
+        <w:numPr>
+          <w:ilvl w:val="0"/>
+          <w:numId w:val="1"/>
+        </w:numPr>
+        <w:rPr>
+          <w:rFonts w:asciiTheme="majorBidi" w:hAnsiTheme="majorBidi" w:cstheme="majorBidi"/>
+          <w:sz w:val="48"/>
+          <w:szCs w:val="48"/>
+          <w:lang w:val="en-US"/>
+        </w:rPr>
+      </w:pPr>
+      <w:r>
+        <w:rPr>
+          <w:rFonts w:asciiTheme="majorBidi" w:hAnsiTheme="majorBidi" w:cstheme="majorBidi"/>
+          <w:sz w:val="48"/>
+          <w:szCs w:val="48"/>
+          <w:lang w:val="en-US"/>
+        </w:rPr>
+        <w:t>Number format exercise</w:t>
+      </w:r>
+    </w:p>
+    <w:p>
+      <w:pPr>
+        <w:pStyle w:val="ListParagraph"/>
+        <w:numPr>
+          <w:ilvl w:val="0"/>
+          <w:numId w:val="1"/>
+        </w:numPr>
+        <w:rPr>
+          <w:rFonts w:asciiTheme="majorBidi" w:hAnsiTheme="majorBidi" w:cstheme="majorBidi"/>
+          <w:sz w:val="48"/>
+          <w:szCs w:val="48"/>
+          <w:lang w:val="en-US"/>
+        </w:rPr>
+      </w:pPr>
+      <w:r>
+        <w:rPr>
+          <w:rFonts w:asciiTheme="majorBidi" w:hAnsiTheme="majorBidi" w:cstheme="majorBidi"/>
+          <w:sz w:val="48"/>
+          <w:szCs w:val="48"/>
+          <w:lang w:val="en-US"/>
+        </w:rPr>
+        <w:t>Quick enter current date</w:t>
+      </w:r>
+    </w:p>
+    <w:p>
+      <w:pPr>
+        <w:pStyle w:val="ListParagraph"/>
+        <w:numPr>
+          <w:ilvl w:val="0"/>
+          <w:numId w:val="1"/>
+        </w:numPr>
+        <w:rPr>
+          <w:rFonts w:asciiTheme="majorBidi" w:hAnsiTheme="majorBidi" w:cstheme="majorBidi"/>
+          <w:sz w:val="48"/>
+          <w:szCs w:val="48"/>
+          <w:lang w:val="en-US"/>
+        </w:rPr>
+      </w:pPr>
+      <w:r>
+        <w:rPr>
+          <w:rFonts w:asciiTheme="majorBidi" w:hAnsiTheme="majorBidi" w:cstheme="majorBidi"/>
+          <w:sz w:val="48"/>
+          <w:szCs w:val="48"/>
+          <w:lang w:val="en-US"/>
+        </w:rPr>
+        <w:t>Short Date / Long Date</w:t>
+      </w:r>
+    </w:p>
+    <w:p>
+      <w:pPr>
+        <w:pStyle w:val="ListParagraph"/>
+        <w:numPr>
+          <w:ilvl w:val="0"/>
+          <w:numId w:val="1"/>
+        </w:numPr>
+        <w:rPr>
+          <w:rFonts w:asciiTheme="majorBidi" w:hAnsiTheme="majorBidi" w:cstheme="majorBidi"/>
+          <w:sz w:val="48"/>
+          <w:szCs w:val="48"/>
+          <w:lang w:val="en-US"/>
+        </w:rPr>
+      </w:pPr>
+      <w:r>
+        <w:rPr>
+          <w:rFonts w:asciiTheme="majorBidi" w:hAnsiTheme="majorBidi" w:cstheme="majorBidi"/>
+          <w:sz w:val="48"/>
+          <w:szCs w:val="48"/>
+          <w:lang w:val="en-US"/>
+        </w:rPr>
+        <w:t>Time number format</w:t>
+      </w:r>
+    </w:p>
+    <w:p>
+      <w:pPr>
+        <w:pStyle w:val="ListParagraph"/>
+        <w:numPr>
+          <w:ilvl w:val="0"/>
+          <w:numId w:val="1"/>
+        </w:numPr>
+        <w:rPr>
+          <w:rFonts w:asciiTheme="majorBidi" w:hAnsiTheme="majorBidi" w:cstheme="majorBidi"/>
+          <w:sz w:val="48"/>
+          <w:szCs w:val="48"/>
+          <w:lang w:val="en-US"/>
+        </w:rPr>
+      </w:pPr>
+      <w:r>
+        <w:rPr>
+          <w:rFonts w:asciiTheme="majorBidi" w:hAnsiTheme="majorBidi" w:cstheme="majorBidi"/>
+          <w:sz w:val="48"/>
+          <w:szCs w:val="48"/>
+          <w:lang w:val="en-US"/>
+        </w:rPr>
+        <w:t>%</w:t>
+      </w:r>
+      <w:r>
+        <w:rPr>
+          <w:rFonts w:asciiTheme="majorBidi" w:hAnsiTheme="majorBidi" w:cstheme="majorBidi"/>
+          <w:sz w:val="48"/>
+          <w:szCs w:val="48"/>
+          <w:lang w:val="en-US"/>
+        </w:rPr>
+        <w:t xml:space="preserve"> Icon Percentage Add % Symbol</w:t>
+      </w:r>
+    </w:p>
+    <w:p>
+      <w:pPr>
+        <w:pStyle w:val="ListParagraph"/>
+        <w:numPr>
+          <w:ilvl w:val="0"/>
+          <w:numId w:val="1"/>
+        </w:numPr>
+        <w:rPr>
+          <w:rFonts w:asciiTheme="majorBidi" w:hAnsiTheme="majorBidi" w:cstheme="majorBidi"/>
+          <w:sz w:val="48"/>
+          <w:szCs w:val="48"/>
+          <w:lang w:val="en-US"/>
+        </w:rPr>
+      </w:pPr>
+      <w:r>
+        <w:rPr>
+          <w:rFonts w:asciiTheme="majorBidi" w:hAnsiTheme="majorBidi" w:cstheme="majorBidi"/>
+          <w:sz w:val="48"/>
+          <w:szCs w:val="48"/>
+          <w:lang w:val="en-US"/>
+        </w:rPr>
+        <w:t>Fraction Number Format</w:t>
+      </w:r>
+    </w:p>
+    <w:p>
+      <w:pPr>
+        <w:pStyle w:val="ListParagraph"/>
+        <w:numPr>
+          <w:ilvl w:val="0"/>
+          <w:numId w:val="1"/>
+        </w:numPr>
+        <w:rPr>
+          <w:rFonts w:asciiTheme="majorBidi" w:hAnsiTheme="majorBidi" w:cstheme="majorBidi"/>
+          <w:sz w:val="48"/>
+          <w:szCs w:val="48"/>
+          <w:lang w:val="en-US"/>
+        </w:rPr>
+      </w:pPr>
+      <w:r>
+        <w:rPr>
+          <w:rFonts w:asciiTheme="majorBidi" w:hAnsiTheme="majorBidi" w:cstheme="majorBidi"/>
+          <w:sz w:val="48"/>
+          <w:szCs w:val="48"/>
+          <w:lang w:val="en-US"/>
+        </w:rPr>
+        <w:t>Scientific Number Format</w:t>
+      </w:r>
+    </w:p>
+    <w:p>
+      <w:pPr>
+        <w:pStyle w:val="ListParagraph"/>
+        <w:numPr>
+          <w:ilvl w:val="0"/>
+          <w:numId w:val="1"/>
+        </w:numPr>
+        <w:rPr>
+          <w:rFonts w:asciiTheme="majorBidi" w:hAnsiTheme="majorBidi" w:cstheme="majorBidi"/>
+          <w:sz w:val="48"/>
+          <w:szCs w:val="48"/>
+          <w:lang w:val="en-US"/>
+        </w:rPr>
+      </w:pPr>
+      <w:r>
+        <w:rPr>
+          <w:rFonts w:asciiTheme="majorBidi" w:hAnsiTheme="majorBidi" w:cstheme="majorBidi"/>
+          <w:sz w:val="48"/>
+          <w:szCs w:val="48"/>
+          <w:lang w:val="en-US"/>
+        </w:rPr>
+        <w:t>Convert Text to Number &amp; Number to Text</w:t>
+      </w:r>
+    </w:p>
+    <w:p>
+      <w:pPr>
+        <w:pStyle w:val="ListParagraph"/>
+        <w:numPr>
+          <w:ilvl w:val="0"/>
+          <w:numId w:val="1"/>
+        </w:numPr>
+        <w:rPr>
+          <w:rFonts w:asciiTheme="majorBidi" w:hAnsiTheme="majorBidi" w:cstheme="majorBidi"/>
+          <w:sz w:val="48"/>
+          <w:szCs w:val="48"/>
+          <w:lang w:val="en-US"/>
+        </w:rPr>
+      </w:pPr>
+      <w:r>
+        <w:rPr>
+          <w:rFonts w:asciiTheme="majorBidi" w:hAnsiTheme="majorBidi" w:cstheme="majorBidi"/>
+          <w:sz w:val="48"/>
+          <w:szCs w:val="48"/>
+          <w:lang w:val="en-US"/>
+        </w:rPr>
+        <w:t>Conditional Formatting Highlight &lt; &gt;</w:t>
+      </w:r>
+    </w:p>
+    <w:p>
+      <w:pPr>
+        <w:pStyle w:val="ListParagraph"/>
+        <w:numPr>
+          <w:ilvl w:val="0"/>
+          <w:numId w:val="1"/>
+        </w:numPr>
+        <w:rPr>
+          <w:rFonts w:asciiTheme="majorBidi" w:hAnsiTheme="majorBidi" w:cstheme="majorBidi"/>
+          <w:sz w:val="48"/>
+          <w:szCs w:val="48"/>
+          <w:lang w:val="en-US"/>
+        </w:rPr>
+      </w:pPr>
+      <w:r>
+        <w:rPr>
+          <w:rFonts w:asciiTheme="majorBidi" w:hAnsiTheme="majorBidi" w:cstheme="majorBidi"/>
+          <w:sz w:val="48"/>
+          <w:szCs w:val="48"/>
+          <w:lang w:val="en-US"/>
+        </w:rPr>
+        <w:t>Highlight Cell Rules</w:t>
+      </w:r>
+    </w:p>
+    <w:p>
+      <w:pPr>
+        <w:pStyle w:val="ListParagraph"/>
+        <w:numPr>
+          <w:ilvl w:val="0"/>
+          <w:numId w:val="1"/>
+        </w:numPr>
+        <w:rPr>
+          <w:rFonts w:asciiTheme="majorBidi" w:hAnsiTheme="majorBidi" w:cstheme="majorBidi"/>
+          <w:sz w:val="48"/>
+          <w:szCs w:val="48"/>
+          <w:lang w:val="en-US"/>
+        </w:rPr>
+      </w:pPr>
+      <w:r>
+        <w:rPr>
+          <w:rFonts w:asciiTheme="majorBidi" w:hAnsiTheme="majorBidi" w:cstheme="majorBidi"/>
+          <w:sz w:val="48"/>
+          <w:szCs w:val="48"/>
+          <w:lang w:val="en-US"/>
+        </w:rPr>
+        <w:lastRenderedPageBreak/>
+        <w:t>Text that Contains Highlight Cell Rules</w:t>
+      </w:r>
+    </w:p>
+    <w:p>
+      <w:pPr>
+        <w:pStyle w:val="ListParagraph"/>
+        <w:numPr>
+          <w:ilvl w:val="0"/>
+          <w:numId w:val="1"/>
+        </w:numPr>
+        <w:rPr>
+          <w:rFonts w:asciiTheme="majorBidi" w:hAnsiTheme="majorBidi" w:cstheme="majorBidi"/>
+          <w:sz w:val="48"/>
+          <w:szCs w:val="48"/>
+          <w:lang w:val="en-US"/>
+        </w:rPr>
+      </w:pPr>
     </w:p>
     <w:sectPr>
       <w:headerReference w:type="even" r:id="rId7"/>
@@ -266,6 +627,7 @@
         </v:shapetype>
         <v:shape id="WordPictureWatermark5315266" o:spid="_x0000_s1026" type="#_x0000_t75" style="position:absolute;margin-left:0;margin-top:0;width:451.1pt;height:451.1pt;z-index:-251657216;mso-position-horizontal:center;mso-position-horizontal-relative:margin;mso-position-vertical:center;mso-position-vertical-relative:margin" o:allowincell="f">
           <v:imagedata r:id="rId1" o:title="AR_Academy_Logo-removebg-preview" gain="19661f" blacklevel="22938f"/>
+          <w10:wrap anchorx="margin" anchory="margin"/>
         </v:shape>
       </w:pict>
     </w:r>
@@ -305,6 +667,7 @@
         </v:shapetype>
         <v:shape id="WordPictureWatermark5315267" o:spid="_x0000_s1027" type="#_x0000_t75" style="position:absolute;margin-left:0;margin-top:0;width:451.1pt;height:451.1pt;z-index:-251656192;mso-position-horizontal:center;mso-position-horizontal-relative:margin;mso-position-vertical:center;mso-position-vertical-relative:margin" o:allowincell="f">
           <v:imagedata r:id="rId1" o:title="AR_Academy_Logo-removebg-preview" gain="19661f" blacklevel="22938f"/>
+          <w10:wrap anchorx="margin" anchory="margin"/>
         </v:shape>
       </w:pict>
     </w:r>
@@ -344,6 +707,7 @@
         </v:shapetype>
         <v:shape id="WordPictureWatermark5315265" o:spid="_x0000_s1025" type="#_x0000_t75" style="position:absolute;margin-left:0;margin-top:0;width:451.1pt;height:451.1pt;z-index:-251658240;mso-position-horizontal:center;mso-position-horizontal-relative:margin;mso-position-vertical:center;mso-position-vertical-relative:margin" o:allowincell="f">
           <v:imagedata r:id="rId1" o:title="AR_Academy_Logo-removebg-preview" gain="19661f" blacklevel="22938f"/>
+          <w10:wrap anchorx="margin" anchory="margin"/>
         </v:shape>
       </w:pict>
     </w:r>

</xml_diff>